<commit_message>
Restructure report headings only
</commit_message>
<xml_diff>
--- a/Progress Report - Reorganized.docx
+++ b/Progress Report - Reorganized.docx
@@ -46,7 +46,7 @@
     </w:p>
     <w:p>
       <w:pPr>
-        <w:spacing w:after="80"/>
+        <w:spacing w:after="100"/>
       </w:pPr>
       <w:r>
         <w:rPr>
@@ -62,7 +62,7 @@
         <w:ind w:left="0"/>
       </w:pPr>
       <w:r>
-        <w:t>Introduction</w:t>
+        <w:t>1. Project Overview</w:t>
       </w:r>
     </w:p>
     <w:p>
@@ -71,43 +71,43 @@
         <w:ind w:left="0"/>
       </w:pPr>
       <w:r>
-        <w:t>Step 1 Preparation and Execution</w:t>
+        <w:t>2. Methodology</w:t>
       </w:r>
     </w:p>
     <w:p>
       <w:pPr>
         <w:spacing w:after="20"/>
-        <w:ind w:left="0"/>
-      </w:pPr>
-      <w:r>
-        <w:t>Step 2 Results</w:t>
+        <w:ind w:left="317"/>
+      </w:pPr>
+      <w:r>
+        <w:t>2.1 Attention Operation and Notation</w:t>
       </w:r>
     </w:p>
     <w:p>
       <w:pPr>
         <w:spacing w:after="20"/>
-        <w:ind w:left="360"/>
-      </w:pPr>
-      <w:r>
-        <w:t>CPU and GPU performance</w:t>
+        <w:ind w:left="0"/>
+      </w:pPr>
+      <w:r>
+        <w:t>3. Experimental Setup and Implementation</w:t>
       </w:r>
     </w:p>
     <w:p>
       <w:pPr>
         <w:spacing w:after="20"/>
-        <w:ind w:left="360"/>
-      </w:pPr>
-      <w:r>
-        <w:t>Correctness and weak scaling</w:t>
+        <w:ind w:left="317"/>
+      </w:pPr>
+      <w:r>
+        <w:t>3.1 Ring Attention Dataflow and Blocking</w:t>
       </w:r>
     </w:p>
     <w:p>
       <w:pPr>
         <w:spacing w:after="20"/>
-        <w:ind w:left="720"/>
-      </w:pPr>
-      <w:r>
-        <w:t>Ring Attention CUDA Kernel Validation on a Single RTX 4090</w:t>
+        <w:ind w:left="634"/>
+      </w:pPr>
+      <w:r>
+        <w:t>3.1.1 Online Softmax Update</w:t>
       </w:r>
     </w:p>
     <w:p>
@@ -116,46 +116,82 @@
         <w:ind w:left="0"/>
       </w:pPr>
       <w:r>
-        <w:t>Conclusion</w:t>
+        <w:t>4. Results</w:t>
       </w:r>
     </w:p>
     <w:p>
       <w:pPr>
         <w:spacing w:after="20"/>
-        <w:ind w:left="0"/>
-      </w:pPr>
-      <w:r>
-        <w:t>APPENDIX</w:t>
+        <w:ind w:left="317"/>
+      </w:pPr>
+      <w:r>
+        <w:t>4.1 CPU and GPU Performance</w:t>
       </w:r>
     </w:p>
     <w:p>
       <w:pPr>
         <w:spacing w:after="20"/>
-        <w:ind w:left="360"/>
-      </w:pPr>
-      <w:r>
-        <w:t>Appendix 1</w:t>
+        <w:ind w:left="317"/>
+      </w:pPr>
+      <w:r>
+        <w:t>4.2 Correctness and Weak Scaling</w:t>
       </w:r>
     </w:p>
     <w:p>
       <w:pPr>
         <w:spacing w:after="20"/>
-        <w:ind w:left="360"/>
-      </w:pPr>
-      <w:r>
-        <w:t>Appendix Code</w:t>
+        <w:ind w:left="634"/>
+      </w:pPr>
+      <w:r>
+        <w:t>4.2.1 Local RTX 4090 Validation</w:t>
       </w:r>
     </w:p>
     <w:p>
       <w:pPr>
-        <w:pStyle w:val="1"/>
-      </w:pPr>
-      <w:r>
-        <w:t>Introduction</w:t>
+        <w:spacing w:after="20"/>
+        <w:ind w:left="0"/>
+      </w:pPr>
+      <w:r>
+        <w:t>5. Conclusion</w:t>
       </w:r>
     </w:p>
     <w:p>
       <w:pPr>
+        <w:spacing w:after="20"/>
+        <w:ind w:left="0"/>
+      </w:pPr>
+      <w:r>
+        <w:t>6. Appendices</w:t>
+      </w:r>
+    </w:p>
+    <w:p>
+      <w:pPr>
+        <w:spacing w:after="20"/>
+        <w:ind w:left="317"/>
+      </w:pPr>
+      <w:r>
+        <w:t>6.1 RTX 4090 Run Evidence</w:t>
+      </w:r>
+    </w:p>
+    <w:p>
+      <w:pPr>
+        <w:spacing w:after="20"/>
+        <w:ind w:left="317"/>
+      </w:pPr>
+      <w:r>
+        <w:t>6.2 Code and Run Scripts</w:t>
+      </w:r>
+    </w:p>
+    <w:p>
+      <w:pPr>
+        <w:pStyle w:val="1"/>
+      </w:pPr>
+      <w:r>
+        <w:t>1. Project Overview</w:t>
+      </w:r>
+    </w:p>
+    <w:p>
+      <w:pPr>
         <w:spacing w:after="140" w:line="278" w:lineRule="auto"/>
         <w:ind w:firstLine="440"/>
       </w:pPr>
@@ -164,6 +200,22 @@
           <w:rFonts w:ascii="Times New Roman" w:hAnsi="Times New Roman"/>
         </w:rPr>
         <w:t>This project implements a distributed attention kernel for long sequences and measures its correctness and runtime on CPU and NVIDIA GPUs. Standard attention computes every query against every key, so the score work grows quadratically with sequence length. Ring Attention distributes query and key/value blocks across GPUs: each GPU keeps its query block, while key/value blocks circulate between ranks. This lets the GPUs share the attention work without gathering the complete key/value sequence on every device.</w:t>
+      </w:r>
+    </w:p>
+    <w:p>
+      <w:pPr>
+        <w:pStyle w:val="1"/>
+      </w:pPr>
+      <w:r>
+        <w:t>2. Methodology</w:t>
+      </w:r>
+    </w:p>
+    <w:p>
+      <w:pPr>
+        <w:pStyle w:val="2"/>
+      </w:pPr>
+      <w:r>
+        <w:t>2.1 Attention Operation and Notation</w:t>
       </w:r>
     </w:p>
     <w:p>
@@ -752,7 +804,7 @@
         <w:pStyle w:val="1"/>
       </w:pPr>
       <w:r>
-        <w:t>Step 1 Preparation and Execution</w:t>
+        <w:t>3. Experimental Setup and Implementation</w:t>
       </w:r>
     </w:p>
     <w:p>
@@ -790,6 +842,14 @@
           <w:rFonts w:ascii="Times New Roman" w:hAnsi="Times New Roman"/>
         </w:rPr>
         <w:t>) received two A40 nodes but stopped before GPU computation: Open MPI placed both ranks on the first node. We changed the launch mapping to one rank per node. The subsequent smoke test and full benchmark both confirmed distinct rank hosts and completed successfully.</w:t>
+      </w:r>
+    </w:p>
+    <w:p>
+      <w:pPr>
+        <w:pStyle w:val="2"/>
+      </w:pPr>
+      <w:r>
+        <w:t>3.1 Ring Attention Dataflow and Blocking</w:t>
       </w:r>
     </w:p>
     <w:p>
@@ -895,6 +955,14 @@
           <w:sz w:val="20"/>
         </w:rPr>
         <w:t>retains its query block and streams key/value tiles from the other rank. </w:t>
+      </w:r>
+    </w:p>
+    <w:p>
+      <w:pPr>
+        <w:pStyle w:val="3"/>
+      </w:pPr>
+      <w:r>
+        <w:t>3.1.1 Online Softmax Update</w:t>
       </w:r>
     </w:p>
     <w:p>
@@ -1649,16 +1717,7 @@
         <w:pStyle w:val="1"/>
       </w:pPr>
       <w:r>
-        <w:t xml:space="preserve">Step </w:t>
-      </w:r>
-      <w:r>
-        <w:rPr>
-          <w:rFonts w:asciiTheme="minorEastAsia" w:eastAsiaTheme="minorEastAsia" w:hAnsiTheme="minorEastAsia" w:hint="eastAsia"/>
-        </w:rPr>
-        <w:t>2</w:t>
-      </w:r>
-      <w:r>
-        <w:t xml:space="preserve"> Results</w:t>
+        <w:t>4. Results</w:t>
       </w:r>
     </w:p>
     <w:p>
@@ -1666,7 +1725,7 @@
         <w:pStyle w:val="2"/>
       </w:pPr>
       <w:r>
-        <w:t>CPU and GPU performance</w:t>
+        <w:t>4.1 CPU and GPU Performance</w:t>
       </w:r>
     </w:p>
     <w:p>
@@ -4069,7 +4128,7 @@
         <w:pStyle w:val="2"/>
       </w:pPr>
       <w:r>
-        <w:t>Correctness and weak scaling</w:t>
+        <w:t>4.2 Correctness and Weak Scaling</w:t>
       </w:r>
     </w:p>
     <w:tbl>
@@ -4530,22 +4589,8 @@
           <w:rFonts w:eastAsiaTheme="minorEastAsia" w:hint="eastAsia"/>
         </w:rPr>
       </w:pPr>
-      <w:commentRangeStart w:id="1"/>
-      <w:r>
-        <w:rPr>
-          <w:rFonts w:eastAsiaTheme="minorEastAsia"/>
-        </w:rPr>
-        <w:t>Ring Attention CUDA Kernel Validation on a Single RTX 4090</w:t>
-      </w:r>
-      <w:commentRangeEnd w:id="1"/>
-      <w:r>
-        <w:rPr>
-          <w:rStyle w:val="af7"/>
-          <w:rFonts w:eastAsiaTheme="minorEastAsia" w:hint="eastAsia"/>
-          <w:sz w:val="24"/>
-          <w:szCs w:val="32"/>
-        </w:rPr>
-        <w:commentReference w:id="1"/>
+      <w:r>
+        <w:t>4.2.1 Local RTX 4090 Validation</w:t>
       </w:r>
     </w:p>
     <w:p>
@@ -5606,7 +5651,7 @@
         <w:pStyle w:val="1"/>
       </w:pPr>
       <w:r>
-        <w:t>Conclusion</w:t>
+        <w:t>5. Conclusion</w:t>
       </w:r>
     </w:p>
     <w:p>
@@ -6009,11 +6054,7 @@
         </w:rPr>
       </w:pPr>
       <w:r>
-        <w:rPr>
-          <w:rFonts w:eastAsiaTheme="minorEastAsia" w:hint="eastAsia"/>
-        </w:rPr>
-        <w:lastRenderedPageBreak/>
-        <w:t>APPENDIX</w:t>
+        <w:t>6. Appendices</w:t>
       </w:r>
     </w:p>
     <w:p>
@@ -6023,13 +6064,8 @@
           <w:rFonts w:eastAsiaTheme="minorEastAsia"/>
         </w:rPr>
       </w:pPr>
-      <w:bookmarkStart w:id="2" w:name="_Appendix_1"/>
-      <w:bookmarkEnd w:id="2"/>
-      <w:r>
-        <w:rPr>
-          <w:rFonts w:eastAsiaTheme="minorEastAsia" w:hint="eastAsia"/>
-        </w:rPr>
-        <w:t xml:space="preserve">Appendix 1 </w:t>
+      <w:r>
+        <w:t>6.1 RTX 4090 Run Evidence</w:t>
       </w:r>
     </w:p>
     <w:p>
@@ -6313,13 +6349,7 @@
         </w:rPr>
       </w:pPr>
       <w:r>
-        <w:t xml:space="preserve">Appendix </w:t>
-      </w:r>
-      <w:r>
-        <w:rPr>
-          <w:rFonts w:hint="eastAsia"/>
-        </w:rPr>
-        <w:t>Code</w:t>
+        <w:t>6.2 Code and Run Scripts</w:t>
       </w:r>
     </w:p>
     <w:p>

</xml_diff>